<commit_message>
Manuscript v3 revision after round-1 review: Exp H, full Exp G table, step-count caveats, wording fixes
Co-Authored-By: Claude Sonnet 5.5 <noreply@anthropic.com>
Claude-Session: https://claude.ai/code/session_017fdFnBNWwmmqUrWFrpu4HP
</commit_message>
<xml_diff>
--- a/Reinforced_Research_Project/manuscript/Final_Manuscript_v3.docx
+++ b/Reinforced_Research_Project/manuscript/Final_Manuscript_v3.docx
@@ -125,7 +125,7 @@
         <w:rPr>
           <w:sz w:val="20"/>
         </w:rPr>
-        <w:t xml:space="preserve">We compared five surrogates (three POD-regressor and two neural) under a common random-search protocol on 36 synthetic PDE instances, with training budgets of 32–1024 solves, three seeds, tie-aware outcomes (±0.10 decade), and controls separating the subspace, the kernel prior and marginal-likelihood fitting. Hypotheses, code and success criteria of each stage were committed to version control before the corresponding runs.</w:t>
+        <w:t xml:space="preserve">We compared five surrogates (three POD-regressor and two neural) under a common random-search protocol on 36 synthetic PDE instances, training budgets of 32–1024 solves, three seeds and tie-aware outcomes (±0.10 decade), with controls for the subspace, the kernel prior and hyper-parameter search. Hypotheses, code and success criteria of each stage were committed to version control before the corresponding runs.</w:t>
       </w:r>
       <w:r>
         <w:rPr>
@@ -151,7 +151,7 @@
         <w:rPr>
           <w:sz w:val="20"/>
         </w:rPr>
-        <w:t xml:space="preserve">Of 24 instances, the linear-subspace family was clearly better in 13, the neural family in 8 and 3 were ties at N = 1024 (at N = 32: 5, 5 and 14); on smooth three-parameter problems the advantage reached up to three decades, and held in 7 of 7 pre-selected new instances. Three of the four Stage-1 confirmatory hypotheses were not supported. A pilot-data diagnostic was not confirmed on new instances (inconclusive; it correlates with parameter dimension). The advantage was explained by marginal-likelihood hyper-parameter fitting (kernel ridge under matched search was a median 14× worse), not by the subspace (a GP without POD matched it). Longer neural training changed the class of 15 of 48 cells, nearly always toward the neural family.</w:t>
+        <w:t xml:space="preserve">Of 24 instances, the linear-subspace family was clearly better in 13, the neural family in 8, with 3 ties, at N = 1024 (N = 32: 5, 5, 14); the N = 1024 counts are confounded with a doubling of the neural training steps. On smooth, mostly three-parameter problems the advantage reached up to about three decades. Three of the four Stage-1 confirmatory hypotheses were not supported, and a pilot-data diagnostic was not confirmed on new instances (inconclusive; it correlates with parameter dimension). A Gaussian process without POD matched the POD pipeline, and a kernel-ridge control that initially looked 14× worse came within a median 2.7× once its hyper-parameter ranges were widened (a post hoc control prompted by an independent review): the advantage reflects regressor and search quality rather than the subspace, and marginal likelihood per se was not isolated. Training the networks four times longer changed the class of 15 of 48 cells, always toward the neural family.</w:t>
       </w:r>
       <w:r>
         <w:rPr>
@@ -177,7 +177,7 @@
         <w:rPr>
           <w:sz w:val="20"/>
         </w:rPr>
-        <w:t xml:space="preserve">In this synthetic benchmark the apparent winner is governed by smoothness, dimension, regressor fitting and tuning symmetry; conclusions about ties and learning-curve crossovers are fragile. Results are limited to synthetic problems and lightly tuned networks.</w:t>
+        <w:t xml:space="preserve">In this synthetic benchmark the apparent winner is governed by smoothness, dimension, regressor and search quality, training budget and tuning symmetry; conclusions about ties and learning-curve crossovers are fragile. Results are limited to synthetic problems and lightly tuned networks.</w:t>
       </w:r>
     </w:p>
     <w:p>
@@ -377,7 +377,7 @@
         <w:rPr>
           <w:sz w:val="20"/>
         </w:rPr>
-        <w:t xml:space="preserve">We compared five surrogates under a common random-search tuning protocol on 36 simulated parametric-PDE instances, preregistering the hypotheses, analysis code and success criteria of each stage in version control before the corresponding results existed. Contributions: (1) a tie-aware map of where each family wins, with effect sizes, over six training budgets; (2) controlled mechanism tests that separate subspace, kernel prior, anisotropy and hyper-parameter fitting; (3) an out-of-sample test of a pilot-data diagnostic, whose frozen form was</w:t>
+        <w:t xml:space="preserve">We compared five surrogates under a common random-search tuning protocol on 36 simulated parametric-PDE instances, preregistering the hypotheses, analysis code and success criteria of each stage in version control before the corresponding results existed. Contributions: (1) a tie-aware map of where each family wins, with effect sizes, over six training budgets; (2) controls that locate the Gaussian-process advantage in the regressor and its hyper-parameter search rather than in the subspace, including a case where a registered control proved too restrictive; (3) an out-of-sample test of a pilot-data diagnostic, whose frozen form was</w:t>
       </w:r>
       <w:r>
         <w:rPr>
@@ -865,6 +865,58 @@
         </w:rPr>
         <w:t xml:space="preserve">: POD with a GP whose kernel has a single isotropic length-scale, fitted by marginal likelihood. Together with POD+GP (anisotropic, marginal-likelihood fitted), these separate the roles of the kernel prior, anisotropy and marginal-likelihood fitting.</w:t>
       </w:r>
+      <w:r>
+        <w:rPr>
+          <w:sz w:val="20"/>
+        </w:rPr>
+        <w:t xml:space="preserve"> </w:t>
+      </w:r>
+      <w:r>
+        <w:rPr>
+          <w:iCs/>
+          <w:i/>
+          <w:sz w:val="20"/>
+        </w:rPr>
+        <w:t xml:space="preserve">POD+KRR-wide</w:t>
+      </w:r>
+      <w:r>
+        <w:rPr>
+          <w:sz w:val="20"/>
+        </w:rPr>
+        <w:t xml:space="preserve"> </w:t>
+      </w:r>
+      <w:r>
+        <w:rPr>
+          <w:sz w:val="20"/>
+        </w:rPr>
+        <w:t xml:space="preserve">(Exp H, added after an independent review) is the same kernel ridge with a much wider ridge (10⁻¹⁶–10⁻², times N) and length-scale range and a symmetric-eigendecomposition solve, searched with B = 8 or 32 trials.</w:t>
+      </w:r>
+      <w:r>
+        <w:rPr>
+          <w:sz w:val="20"/>
+        </w:rPr>
+        <w:t xml:space="preserve"> </w:t>
+      </w:r>
+      <w:r>
+        <w:rPr>
+          <w:iCs/>
+          <w:i/>
+          <w:sz w:val="20"/>
+        </w:rPr>
+        <w:t xml:space="preserve">GP-full</w:t>
+      </w:r>
+      <w:r>
+        <w:rPr>
+          <w:sz w:val="20"/>
+        </w:rPr>
+        <w:t xml:space="preserve"> </w:t>
+      </w:r>
+      <w:r>
+        <w:rPr>
+          <w:sz w:val="20"/>
+        </w:rPr>
+        <w:t xml:space="preserve">is a GP on the full output field without POD (one shared ARD kernel fitted on at most 300 points; B = 2). Methods are compared in the family-level outcome ȳ; the mechanism controls compare against the oracle-best network (by test error) in cells where POD+GP-ARD clearly wins.</w:t>
+      </w:r>
     </w:p>
     <w:p>
       <w:pPr>
@@ -1272,7 +1324,7 @@
         <w:rPr>
           <w:sz w:val="20"/>
         </w:rPr>
-        <w:t xml:space="preserve">: after seeing Experiment A (diagnostic not confirmed) and Experiment D, an addendum fixed, before the runs, Experiment A2 (the 8 candidates; qualifying instances chosen by a pilot-only rule f1 &lt; −2; a prediction and its success criteria) and Experiment E (isotropic-GP control with a pre-specified decision rule). Stage-3 experiments are post hoc in</w:t>
+        <w:t xml:space="preserve">: after seeing Experiment A (diagnostic not confirmed) and Experiment D, an addendum fixed, before the runs, Experiment A2 (the 8 candidates; qualifying instances chosen by a pilot-only rule f1 &lt; −2; a prediction and its success criteria) and Experiment E (isotropic-GP control with a pre-specified decision rule).</w:t>
       </w:r>
       <w:r>
         <w:rPr>
@@ -1286,19 +1338,19 @@
           <w:i/>
           <w:sz w:val="20"/>
         </w:rPr>
-        <w:t xml:space="preserve">motivation</w:t>
-      </w:r>
-      <w:r>
-        <w:rPr>
-          <w:sz w:val="20"/>
-        </w:rPr>
-        <w:t xml:space="preserve"> </w:t>
-      </w:r>
-      <w:r>
-        <w:rPr>
-          <w:sz w:val="20"/>
-        </w:rPr>
-        <w:t xml:space="preserve">but preregistered in</w:t>
+        <w:t xml:space="preserve">Stage 4</w:t>
+      </w:r>
+      <w:r>
+        <w:rPr>
+          <w:sz w:val="20"/>
+        </w:rPr>
+        <w:t xml:space="preserve"> </w:t>
+      </w:r>
+      <w:r>
+        <w:rPr>
+          <w:sz w:val="20"/>
+        </w:rPr>
+        <w:t xml:space="preserve">(addendum v2.2, before the runs): Experiment A3 (descriptive probes of the diagnostic–dimension confound), Experiment G (GP without POD) and Experiment F (float64 and L-BFGS refits of the networks).</w:t>
       </w:r>
       <w:r>
         <w:rPr>
@@ -1312,13 +1364,65 @@
           <w:i/>
           <w:sz w:val="20"/>
         </w:rPr>
+        <w:t xml:space="preserve">Stage 5</w:t>
+      </w:r>
+      <w:r>
+        <w:rPr>
+          <w:sz w:val="20"/>
+        </w:rPr>
+        <w:t xml:space="preserve"> </w:t>
+      </w:r>
+      <w:r>
+        <w:rPr>
+          <w:sz w:val="20"/>
+        </w:rPr>
+        <w:t xml:space="preserve">(addendum v2.3, after an independent AI review of the draft showed on one cell that the kernel-ridge control’s ridge range was too restrictive): Experiment H (wide-range kernel ridge, with predictions and decision rules fixed before the run). Stage-3 experiments are post hoc in</w:t>
+      </w:r>
+      <w:r>
+        <w:rPr>
+          <w:sz w:val="20"/>
+        </w:rPr>
+        <w:t xml:space="preserve"> </w:t>
+      </w:r>
+      <w:r>
+        <w:rPr>
+          <w:iCs/>
+          <w:i/>
+          <w:sz w:val="20"/>
+        </w:rPr>
+        <w:t xml:space="preserve">motivation</w:t>
+      </w:r>
+      <w:r>
+        <w:rPr>
+          <w:sz w:val="20"/>
+        </w:rPr>
+        <w:t xml:space="preserve"> </w:t>
+      </w:r>
+      <w:r>
+        <w:rPr>
+          <w:sz w:val="20"/>
+        </w:rPr>
+        <w:t xml:space="preserve">but preregistered in</w:t>
+      </w:r>
+      <w:r>
+        <w:rPr>
+          <w:sz w:val="20"/>
+        </w:rPr>
+        <w:t xml:space="preserve"> </w:t>
+      </w:r>
+      <w:r>
+        <w:rPr>
+          <w:iCs/>
+          <w:i/>
+          <w:sz w:val="20"/>
+        </w:rPr>
         <w:t xml:space="preserve">prediction</w:t>
       </w:r>
       <w:r>
         <w:rPr>
           <w:sz w:val="20"/>
         </w:rPr>
-        <w:t xml:space="preserve">. The preregistrations are git histories on the authors’ repository, not independent registry entries.</w:t>
+        <w:t xml:space="preserve">. The 1e-16–1e-2 range of Experiment H and its two budgets (B = 8, 32) were chosen with knowledge of that review cell. The preregistrations are git histories on the authors’ repository, not independent registry entries.</w:t>
       </w:r>
     </w:p>
     <w:p>
@@ -6175,7 +6279,7 @@
         <w:rPr>
           <w:sz w:val="20"/>
         </w:rPr>
-        <w:t xml:space="preserve">from the result files in the repository; the verdicts are against criteria registered before the corresponding runs (§4). Unless stated, ȳ is the seed-mean of log₁₀(err_NL</w:t>
+        <w:t xml:space="preserve">from the result files in the repository; verdicts are against criteria registered before the corresponding runs (§4). Unless stated, ȳ is the seed-mean of log₁₀(err_NL</w:t>
       </w:r>
       <w:r>
         <w:rPr>
@@ -6189,7 +6293,59 @@
         <w:rPr>
           <w:sz w:val="20"/>
         </w:rPr>
-        <w:t xml:space="preserve">) and the unit of inference is the instance.</w:t>
+        <w:t xml:space="preserve">) with validation-selected winners, and the unit of inference is the instance. Two cautions apply to every count below: (i)</w:t>
+      </w:r>
+      <w:r>
+        <w:rPr>
+          <w:sz w:val="20"/>
+        </w:rPr>
+        <w:t xml:space="preserve"> </w:t>
+      </w:r>
+      <w:r>
+        <w:rPr>
+          <w:bCs/>
+          <w:b/>
+          <w:sz w:val="20"/>
+        </w:rPr>
+        <w:t xml:space="preserve">all N = 1024 results are confounded with a change in the neural training schedule</w:t>
+      </w:r>
+      <w:r>
+        <w:rPr>
+          <w:sz w:val="20"/>
+        </w:rPr>
+        <w:t xml:space="preserve"> </w:t>
+      </w:r>
+      <w:r>
+        <w:rPr>
+          <w:sz w:val="20"/>
+        </w:rPr>
+        <w:t xml:space="preserve">— full-batch Adam (1500 steps) for N ≤ 512 but mini-batches of 512 (3000 steps) at N = 1024, so the networks receive twice the optimisation steps there (their median error gain per doubling of N is 0.10 decade from 256 to 512 but 0.24 from 512 to 1024, against 0.23 and 0.22 for the linear-subspace family); (ii) the three random-search draws per method (one per seed) are</w:t>
+      </w:r>
+      <w:r>
+        <w:rPr>
+          <w:sz w:val="20"/>
+        </w:rPr>
+        <w:t xml:space="preserve"> </w:t>
+      </w:r>
+      <w:r>
+        <w:rPr>
+          <w:bCs/>
+          <w:b/>
+          <w:sz w:val="20"/>
+        </w:rPr>
+        <w:t xml:space="preserve">shared across all instances and all N</w:t>
+      </w:r>
+      <w:r>
+        <w:rPr>
+          <w:sz w:val="20"/>
+        </w:rPr>
+        <w:t xml:space="preserve"> </w:t>
+      </w:r>
+      <w:r>
+        <w:rPr>
+          <w:sz w:val="20"/>
+        </w:rPr>
+        <w:t xml:space="preserve">(design property, disclosed in the deviations log), so seeds are not independent replicates of the tuning.</w:t>
       </w:r>
     </w:p>
     <w:bookmarkStart w:id="29" w:name="where-each-family-wins"/>
@@ -6212,7 +6368,59 @@
         <w:rPr>
           <w:sz w:val="20"/>
         </w:rPr>
-        <w:t xml:space="preserve">Across the 24 instances of the original study and Experiment A, the outcome depends strongly on the training budget (Figure 1, Table 2). At N = 32, 5 instances favour the linear-subspace family clearly, 5 favour the neural family clearly and 14 are ties; at N = 1024 the counts are 13, 8 and 3. Where the linear-subspace family wins, it can win by orders of magnitude: ȳ₁₀₂₄ = 3.3 (bratu_L1), 2.7 (nlheat_L1), 2.2 (burgers_L1); where the neural family wins, the margin is at most 0.44 decade. Of the 8 further smooth candidates of Experiment A2, 8 of 8 are linear-subspace-clear at N = 1024 (ȳ between 1.0 and 2.9). The neural-network-favourable cases are concentrated in problems with moving or discontinuous features (transport_L2, heat2d_L2, incl, kdv_L1) and in some high-dimensional parameter spaces (darcyhd, p = 16 and 32). The earlier headline that neural networks</w:t>
+        <w:t xml:space="preserve">Across the 24 instances of the original study and Experiment A, the outcome depends strongly on the training budget (Figure 1, Table 2). At N = 32, 5 instances favour the linear-subspace family clearly, 5 the neural family and 14 are ties; at N = 1024 the counts are 13, 8 and 3 (the NN-clear count is 6–8 depending on the tie band, Table 5). Where the linear-subspace family wins it can win by orders of magnitude: ȳ₁₀₂₄ = 3.3 (bratu_L1), 2.7 (nlheat_L1), 2.2 (burgers_L1); where the neural family wins, the margin is at most 0.44 decade at the default budget. All 8 smooth candidates of Experiment A2 are linear-subspace-clear at N = 1024 (ȳ between 1.0 and 2.9). The neural-favourable cases are concentrated in problems with moving or discontinuous features (transport_L2, heat2d_L2, incl, kdv_L1) and in some high-dimensional parameter spaces (darcyhd, p = 16 and 32);</w:t>
+      </w:r>
+      <w:r>
+        <w:rPr>
+          <w:sz w:val="20"/>
+        </w:rPr>
+        <w:t xml:space="preserve"> </w:t>
+      </w:r>
+      <w:r>
+        <w:rPr>
+          <w:bCs/>
+          <w:b/>
+          <w:sz w:val="20"/>
+        </w:rPr>
+        <w:t xml:space="preserve">however, a Gaussian process on the full field without POD (Exp G) beats the best network in several of these</w:t>
+      </w:r>
+      <w:r>
+        <w:rPr>
+          <w:sz w:val="20"/>
+        </w:rPr>
+        <w:t xml:space="preserve"> </w:t>
+      </w:r>
+      <w:r>
+        <w:rPr>
+          <w:sz w:val="20"/>
+        </w:rPr>
+        <w:t xml:space="preserve">(Table 4), so part of the neural advantage in this map is attributable to POD truncation of the</w:t>
+      </w:r>
+      <w:r>
+        <w:rPr>
+          <w:sz w:val="20"/>
+        </w:rPr>
+        <w:t xml:space="preserve"> </w:t>
+      </w:r>
+      <w:r>
+        <w:rPr>
+          <w:iCs/>
+          <w:i/>
+          <w:sz w:val="20"/>
+        </w:rPr>
+        <w:t xml:space="preserve">particular</w:t>
+      </w:r>
+      <w:r>
+        <w:rPr>
+          <w:sz w:val="20"/>
+        </w:rPr>
+        <w:t xml:space="preserve"> </w:t>
+      </w:r>
+      <w:r>
+        <w:rPr>
+          <w:sz w:val="20"/>
+        </w:rPr>
+        <w:t xml:space="preserve">pipeline rather than to neural regression. The earlier headline that neural networks</w:t>
       </w:r>
       <w:r>
         <w:rPr>
@@ -6943,7 +7151,7 @@
           <w:i/>
           <w:sz w:val="20"/>
         </w:rPr>
-        <w:t xml:space="preserve">Table 2. Cell classification of the 24 instances by training budget (tie band ±0.10 decade).</w:t>
+        <w:t xml:space="preserve">Table 2. Cell classification of the 24 instances by training budget (tie band ±0.10 decade). N = 1024 is step-count-confounded (see above).</w:t>
       </w:r>
     </w:p>
     <w:p>
@@ -6954,27 +7162,7 @@
         <w:rPr>
           <w:sz w:val="20"/>
         </w:rPr>
-        <w:t xml:space="preserve">Stage-1 confirmatory hypotheses were largely not supported (Table 3): the family difference at N = 32 has median ȳ = -0.059, and ȳ did not fall systematically with N (5 of 16 instances).</w:t>
-      </w:r>
-      <w:r>
-        <w:rPr>
-          <w:sz w:val="20"/>
-        </w:rPr>
-        <w:t xml:space="preserve"> </w:t>
-      </w:r>
-      <w:r>
-        <w:rPr>
-          <w:bCs/>
-          <w:b/>
-          <w:sz w:val="20"/>
-        </w:rPr>
-        <w:t xml:space="preserve">The pre-registered trend of ȳ with N must be read with a confound in mind</w:t>
-      </w:r>
-      <w:r>
-        <w:rPr>
-          <w:sz w:val="20"/>
-        </w:rPr>
-        <w:t xml:space="preserve">: the training loop uses full-batch Adam (1500 steps) for N ≤ 512 but mini-batches of 512 for N = 1024 (3000 steps), so the neural family receives twice the optimisation steps at the largest budget, and its error improves visibly more from N = 512 to 1024 than from 256 to 512 (design audit; step-count note in the repository). We therefore make no claim about learning-curve crossovers.</w:t>
+        <w:t xml:space="preserve">Stage-1 confirmatory hypotheses were largely not supported (Table 3): the family difference at N = 32 has median ȳ = -0.059, and ȳ did not fall systematically with N (5 of 16 instances). Because of the step-count change we make no claim about learning-curve crossovers.</w:t>
       </w:r>
     </w:p>
     <w:tbl>
@@ -8032,7 +8220,7 @@
           <w:i/>
           <w:sz w:val="20"/>
         </w:rPr>
-        <w:t xml:space="preserve">Table 3. Pre-registered confirmatory and primary tests. Holm adjustment within each stage.</w:t>
+        <w:t xml:space="preserve">Table 3. Pre-registered confirmatory and primary tests. Holm adjustment within each stage. H2 compares against the baseline {log₂N, p}, whose leave-one-family-out RMSE (4.17) is far worse than that of {log₂N} alone (1.12) because p = 10 is extrapolated from p ≤ 4; against {log₂N} the gain is about 0.2 and the verdict is unchanged.</w:t>
       </w:r>
       <w:r>
         <w:rPr>
@@ -8072,7 +8260,7 @@
           <w:i/>
           <w:sz w:val="20"/>
         </w:rPr>
-        <w:t xml:space="preserve">: the confidence interval’s lower limit is −0.001.</w:t>
+        <w:t xml:space="preserve">: the lower CI limit is −0.001. S1: in the 10 new non-tie cells the majority share is 0.50, 4 of the 6 correct cells are nlheat, so the test is uninformative.</w:t>
       </w:r>
     </w:p>
     <w:bookmarkEnd w:id="29"/>
@@ -8096,7 +8284,7 @@
         <w:rPr>
           <w:sz w:val="20"/>
         </w:rPr>
-        <w:t xml:space="preserve">A frozen rule built from the original data (threshold t = −0.52 on f1; a two-feature regression R2) was tested out of sample on 8 new instances (4 new families, two levels each). P1 was not significant (ρ = -0.381, exact p = 0.180) and P2 was a near miss (out-of-sample squared-error gain 0.598; instance-bootstrap p = 0.025, Holm-adjusted 0.051); the frozen threshold rule classified 6 of 10 non-tie cells correctly, below the 70.8% majority baseline. The pre-registered verdict is therefore</w:t>
+        <w:t xml:space="preserve">A frozen rule built from the original data (threshold t = −0.52 on f1; a two-feature regression R2) was tested out of sample on 8 new instances (4 new families, two levels each). P1 was not significant (ρ = -0.381, exact p = 0.180) and P2 was a near miss (out-of-sample squared-error gain 0.598; instance-bootstrap p = 0.025 with 10⁶ draws, Holm-adjusted 0.051; the pre-registered 10⁴-draw analysis gave 0.027 and 0.055); the frozen threshold rule classified 6 of 10 non-tie cells correctly. The pre-registered verdict is</w:t>
       </w:r>
       <w:r>
         <w:rPr>
@@ -8116,7 +8304,7 @@
         <w:rPr>
           <w:sz w:val="20"/>
         </w:rPr>
-        <w:t xml:space="preserve">, but the right reading is</w:t>
+        <w:t xml:space="preserve">; the right reading is</w:t>
       </w:r>
       <w:r>
         <w:rPr>
@@ -8136,7 +8324,7 @@
         <w:rPr>
           <w:sz w:val="20"/>
         </w:rPr>
-        <w:t xml:space="preserve">: the test has 8 instances in 4 families, its power at the pre-specified effect is modest (≈0.5 in a simulation by an independent audit), 88% of the P2 gain comes from the two nlheat instances, and the correlation changes sign without them (ρ = 0.49). In addition, f1 is correlated with the parameter dimension (Spearman ρ = 0.71 across the 24 instances) and every instance with f1 &lt; −2 has p = 3 (Figure 2).</w:t>
+        <w:t xml:space="preserve">: the test has 8 instances in 4 families, 88% of the P2 gain comes from the two nlheat instances, and the correlation changes sign without them (ρ = 0.49). In addition, f1 is correlated with the parameter dimension (Spearman ρ = 0.71 across the 24 instances), and among those 24 every instance with f1 &lt; −2 has p = 3 (Figure 2; across all 36 instances diff1d_L1 has f1 = −2.18 with p = 4).</w:t>
       </w:r>
     </w:p>
     <w:p>
@@ -8208,7 +8396,43 @@
         <w:rPr>
           <w:sz w:val="20"/>
         </w:rPr>
-        <w:t xml:space="preserve">Two follow-up experiments probed this confound (neither can be confirmatory). In Experiment A2, a pilot-only rule (f1 &lt; −2) selected 7 of 8 candidate instances; all 7 reached ȳ₁₀₂₄ ≥ 1 decade (pre-registered criterion: ≥ 4 of 7 against a baseline rate of 0.15; exact p = 1.7e-06) and none favoured the neural family. But six of the seven have p = 3, and the single control (p = 8, f1 = −1.72) also had ȳ₁₀₂₄ = 1.00. In Experiment A3, two p = 3 problems with moving features (f1 = -0.23, -1.29) favoured the neural family (ȳ₁₀₂₄ = -0.44, -0.21), indicating that f1 carries information beyond dimension, while two nearly linear high-dimensional problems (p = 16, 32) had f1 ≈ −1.6, by construction (r = 4 modes cannot capture a nearly linear map in 16 or 32 parameters), and only mildly favoured the linear-subspace family (ȳ₁₀₂₄ = 0.48, 0.18). Pooled over the 24 instances and leaving one family out at a time, adding f1 to {log₂N} lowers the cross-validated RMSE from 1.07 to 0.62 (exploratory; the features were first selected on 16 of these instances, so this is not independent evidence). Our summary is that a cheap pilot statistic is informative about</w:t>
+        <w:t xml:space="preserve">Two follow-up experiments probed this confound (neither can be confirmatory). In Experiment A2, a pilot-only rule (f1 &lt; −2) selected 7 of 8 candidate instances, which belong to four authors-designed smooth families (two levels each); all 7 reached ȳ₁₀₂₄ ≥ 1 decade (the pre-registered criterion was ≥ 4 of 7 against a baseline rate of 0.15, which was met; we do not attach weight to the resulting binomial p-value because the 7 instances are not independent and the candidates were chosen after smooth p = 3 problems were seen to be won by the GP). Six of the seven have p = 3, and the single control (p = 8, f1 = −1.72) had ȳ₁₀₂₄ = 0.997, practically the same as the</w:t>
+      </w:r>
+      <w:r>
+        <w:rPr>
+          <w:sz w:val="20"/>
+        </w:rPr>
+        <w:t xml:space="preserve"> </w:t>
+      </w:r>
+      <w:r>
+        <w:rPr>
+          <w:sz w:val="20"/>
+        </w:rPr>
+        <w:t xml:space="preserve">“</w:t>
+      </w:r>
+      <w:r>
+        <w:rPr>
+          <w:sz w:val="20"/>
+        </w:rPr>
+        <w:t xml:space="preserve">decisive</w:t>
+      </w:r>
+      <w:r>
+        <w:rPr>
+          <w:sz w:val="20"/>
+        </w:rPr>
+        <w:t xml:space="preserve">”</w:t>
+      </w:r>
+      <w:r>
+        <w:rPr>
+          <w:sz w:val="20"/>
+        </w:rPr>
+        <w:t xml:space="preserve"> </w:t>
+      </w:r>
+      <w:r>
+        <w:rPr>
+          <w:sz w:val="20"/>
+        </w:rPr>
+        <w:t xml:space="preserve">ones, so A2 does not show that f1 separates anything beyond smooth low-dimensional problems. In Experiment A3, two p = 3 problems with moving features (f1 = -0.23, -1.29) favoured the neural family (ȳ₁₀₂₄ = -0.44, -0.21), consistent with f1 carrying information beyond dimension, while two nearly linear high-dimensional problems (p = 16, 32) had f1 ≈ −1.6 by construction (r = 4 modes cannot capture a nearly linear map in 16 or 32 parameters) and only mildly favoured the linear-subspace family (ȳ₁₀₂₄ = 0.48, 0.18). Pooled over the 24 instances and leaving one family out at a time, adding f1 to {log₂N} lowers the cross-validated RMSE from 1.07 to 0.62 (exploratory; the features were first selected on 16 of these instances; the baseline {log₂N, log₂p} gives 1.47). We conclude that a cheap pilot statistic is informative about</w:t>
       </w:r>
       <w:r>
         <w:rPr>
@@ -8238,7 +8462,7 @@
       </w:r>
     </w:p>
     <w:bookmarkEnd w:id="33"/>
-    <w:bookmarkStart w:id="37" w:name="X8afb6c554764491cac209a3d789aa13bc995808"/>
+    <w:bookmarkStart w:id="37" w:name="Xbbe906efb77dfa6d2ebe4ccea16868fccfd41e5"/>
     <w:p>
       <w:pPr>
         <w:pStyle w:val="Heading3"/>
@@ -8247,7 +8471,7 @@
         <w:rPr>
           <w:sz w:val="20"/>
         </w:rPr>
-        <w:t xml:space="preserve">5.3 Why the linear-subspace family wins: the regressor and its fitting, not the subspace</w:t>
+        <w:t xml:space="preserve">5.3 What drives the Gaussian-process advantage</w:t>
       </w:r>
     </w:p>
     <w:p>
@@ -8258,7 +8482,209 @@
         <w:rPr>
           <w:sz w:val="20"/>
         </w:rPr>
-        <w:t xml:space="preserve">The kernel-ridge control, tuned by the same B = 8 random search as every other method but without marginal-likelihood fitting, is much worse than POD+GP: in the 52 cells where POD+GP clearly beats the best network, the median error ratio is 14.3× (only 13% of cells within 3×; 90–490× in the smoothest instances), so the pre-registered conjecture that matched tuning would close the gap (D1) is rejected. An isotropic-kernel GP fitted by marginal likelihood is within a median 1.92× of the anisotropic GP, whereas kernel ridge is 8.1× worse than the isotropic GP; by the pre-registered rule this identifies marginal-likelihood fitting (</w:t>
+        <w:t xml:space="preserve">We ran four controls (Table 4, Figure 3). (i)</w:t>
+      </w:r>
+      <w:r>
+        <w:rPr>
+          <w:sz w:val="20"/>
+        </w:rPr>
+        <w:t xml:space="preserve"> </w:t>
+      </w:r>
+      <w:r>
+        <w:rPr>
+          <w:iCs/>
+          <w:i/>
+          <w:sz w:val="20"/>
+        </w:rPr>
+        <w:t xml:space="preserve">Kernel ridge with the registered search</w:t>
+      </w:r>
+      <w:r>
+        <w:rPr>
+          <w:sz w:val="20"/>
+        </w:rPr>
+        <w:t xml:space="preserve"> </w:t>
+      </w:r>
+      <w:r>
+        <w:rPr>
+          <w:sz w:val="20"/>
+        </w:rPr>
+        <w:t xml:space="preserve">(POD+KRR, ridge λN with λ ∈ [10⁻¹⁰, 10⁻²], one length-scale, B = 8) is a median 14.3× worse than POD+GP in the 52 cells where POD+GP clearly beats the best network (only 13% within 3×), so the pre-registered conjecture that matched tuning would close the gap (D1) is rejected for</w:t>
+      </w:r>
+      <w:r>
+        <w:rPr>
+          <w:sz w:val="20"/>
+        </w:rPr>
+        <w:t xml:space="preserve"> </w:t>
+      </w:r>
+      <w:r>
+        <w:rPr>
+          <w:iCs/>
+          <w:i/>
+          <w:sz w:val="20"/>
+        </w:rPr>
+        <w:t xml:space="preserve">that</w:t>
+      </w:r>
+      <w:r>
+        <w:rPr>
+          <w:sz w:val="20"/>
+        </w:rPr>
+        <w:t xml:space="preserve"> </w:t>
+      </w:r>
+      <w:r>
+        <w:rPr>
+          <w:sz w:val="20"/>
+        </w:rPr>
+        <w:t xml:space="preserve">control. (ii)</w:t>
+      </w:r>
+      <w:r>
+        <w:rPr>
+          <w:sz w:val="20"/>
+        </w:rPr>
+        <w:t xml:space="preserve"> </w:t>
+      </w:r>
+      <w:r>
+        <w:rPr>
+          <w:iCs/>
+          <w:i/>
+          <w:sz w:val="20"/>
+        </w:rPr>
+        <w:t xml:space="preserve">A post-hoc control prompted by an independent review</w:t>
+      </w:r>
+      <w:r>
+        <w:rPr>
+          <w:sz w:val="20"/>
+        </w:rPr>
+        <w:t xml:space="preserve"> </w:t>
+      </w:r>
+      <w:r>
+        <w:rPr>
+          <w:sz w:val="20"/>
+        </w:rPr>
+        <w:t xml:space="preserve">(Exp H, pre-registered before it ran) widened the kernel-ridge ridge range to [10⁻¹⁶, 10⁻²] and the length-scale range to [0.1, 30]: the median ratio to POD+GP in the 28 GP-clear cells of the N ∈ {64, 256, 1024} subset falls to 6.5× with B = 8 and to 2.7× with B = 32 (57% of cells within 3×; neither pre-registered attribution,</w:t>
+      </w:r>
+      <w:r>
+        <w:rPr>
+          <w:sz w:val="20"/>
+        </w:rPr>
+        <w:t xml:space="preserve"> </w:t>
+      </w:r>
+      <w:r>
+        <w:rPr>
+          <w:sz w:val="20"/>
+        </w:rPr>
+        <w:t xml:space="preserve">“</w:t>
+      </w:r>
+      <w:r>
+        <w:rPr>
+          <w:sz w:val="20"/>
+        </w:rPr>
+        <w:t xml:space="preserve">range</w:t>
+      </w:r>
+      <w:r>
+        <w:rPr>
+          <w:sz w:val="20"/>
+        </w:rPr>
+        <w:t xml:space="preserve">”</w:t>
+      </w:r>
+      <w:r>
+        <w:rPr>
+          <w:sz w:val="20"/>
+        </w:rPr>
+        <w:t xml:space="preserve"> </w:t>
+      </w:r>
+      <w:r>
+        <w:rPr>
+          <w:sz w:val="20"/>
+        </w:rPr>
+        <w:t xml:space="preserve">or</w:t>
+      </w:r>
+      <w:r>
+        <w:rPr>
+          <w:sz w:val="20"/>
+        </w:rPr>
+        <w:t xml:space="preserve"> </w:t>
+      </w:r>
+      <w:r>
+        <w:rPr>
+          <w:sz w:val="20"/>
+        </w:rPr>
+        <w:t xml:space="preserve">“</w:t>
+      </w:r>
+      <w:r>
+        <w:rPr>
+          <w:sz w:val="20"/>
+        </w:rPr>
+        <w:t xml:space="preserve">marginal likelihood</w:t>
+      </w:r>
+      <w:r>
+        <w:rPr>
+          <w:sz w:val="20"/>
+        </w:rPr>
+        <w:t xml:space="preserve">”</w:t>
+      </w:r>
+      <w:r>
+        <w:rPr>
+          <w:sz w:val="20"/>
+        </w:rPr>
+        <w:t xml:space="preserve">, was met), and the wide-range KRR beats the best network by more than 0.1 decade in 64% of those cells. The Exp D gap was therefore largely a property of the restricted range and coarse search of the control. (iii) An isotropic-kernel GP fitted by marginal likelihood is within a median 1.92× of the anisotropic GP (but more than 3× worse in 29% of cells) and the restricted kernel ridge is 8.1× worse than it; this rule (M-MLII, median-based) was met in these p = 3–4 cells but, given (ii), it cannot be read as isolating marginal likelihood. (iv) A GP on the</w:t>
+      </w:r>
+      <w:r>
+        <w:rPr>
+          <w:sz w:val="20"/>
+        </w:rPr>
+        <w:t xml:space="preserve"> </w:t>
+      </w:r>
+      <w:r>
+        <w:rPr>
+          <w:iCs/>
+          <w:i/>
+          <w:sz w:val="20"/>
+        </w:rPr>
+        <w:t xml:space="preserve">full</w:t>
+      </w:r>
+      <w:r>
+        <w:rPr>
+          <w:sz w:val="20"/>
+        </w:rPr>
+        <w:t xml:space="preserve"> </w:t>
+      </w:r>
+      <w:r>
+        <w:rPr>
+          <w:sz w:val="20"/>
+        </w:rPr>
+        <w:t xml:space="preserve">field without POD matches POD+GP in the GP-clear cells (median ratio 0.95×; G1 supported) and is clearly better than the best network in 18 of 24 instances at N = 1024 against 12 for POD+GP (Table 4). Further, POD+Poly, which has neither a kernel nor marginal likelihood, is a median 9.9× worse than POD+GP in the same 52 cells but still beats the best network by more than 0.1 decade in 23 of them, and a</w:t>
+      </w:r>
+      <w:r>
+        <w:rPr>
+          <w:sz w:val="20"/>
+        </w:rPr>
+        <w:t xml:space="preserve"> </w:t>
+      </w:r>
+      <w:r>
+        <w:rPr>
+          <w:iCs/>
+          <w:i/>
+          <w:sz w:val="20"/>
+        </w:rPr>
+        <w:t xml:space="preserve">direct</w:t>
+      </w:r>
+      <w:r>
+        <w:rPr>
+          <w:sz w:val="20"/>
+        </w:rPr>
+        <w:t xml:space="preserve"> </w:t>
+      </w:r>
+      <w:r>
+        <w:rPr>
+          <w:sz w:val="20"/>
+        </w:rPr>
+        <w:t xml:space="preserve">network beats the network on POD coefficients by more than 0.1 decade in 17 of 24 instances at N = 1024 (the opposite in 1). Our reading is that, in this benchmark, the advantage of the Gaussian-process pipeline is the advantage of a</w:t>
+      </w:r>
+      <w:r>
+        <w:rPr>
+          <w:sz w:val="20"/>
+        </w:rPr>
+        <w:t xml:space="preserve"> </w:t>
       </w:r>
       <w:r>
         <w:rPr>
@@ -8266,13 +8692,13 @@
           <w:b/>
           <w:sz w:val="20"/>
         </w:rPr>
-        <w:t xml:space="preserve">M-MLII</w:t>
-      </w:r>
-      <w:r>
-        <w:rPr>
-          <w:sz w:val="20"/>
-        </w:rPr>
-        <w:t xml:space="preserve">) rather than anisotropy as the main source of the advantage in the cells where it exists (p = 3 and 4 only; the experiment says nothing about high-dimensional parameter spaces). A GP on the full field without POD matches POD+GP (median ratio 0.95×; G1 supported), so subspace truncation is not what makes the family accurate. Finally, a</w:t>
+        <w:t xml:space="preserve">smooth regressor whose hyper-parameters (notably the effective ridge/noise level) are searched over a wide range and finely</w:t>
+      </w:r>
+      <w:r>
+        <w:rPr>
+          <w:sz w:val="20"/>
+        </w:rPr>
+        <w:t xml:space="preserve">, and of the lightly tuned networks’ failure to reach the near-interpolation regime, not a property of the POD subspace; marginal likelihood</w:t>
       </w:r>
       <w:r>
         <w:rPr>
@@ -8286,91 +8712,19 @@
           <w:i/>
           <w:sz w:val="20"/>
         </w:rPr>
-        <w:t xml:space="preserve">direct</w:t>
-      </w:r>
-      <w:r>
-        <w:rPr>
-          <w:sz w:val="20"/>
-        </w:rPr>
-        <w:t xml:space="preserve"> </w:t>
-      </w:r>
-      <w:r>
-        <w:rPr>
-          <w:sz w:val="20"/>
-        </w:rPr>
-        <w:t xml:space="preserve">neural network beats the neural network on POD coefficients by more than 0.1 decade in 17 of 24 instances at N = 1024 (the opposite in 1), whereas POD+GP beats the best direct/bottleneck network by more than 0.1 decade in 12. The family label</w:t>
-      </w:r>
-      <w:r>
-        <w:rPr>
-          <w:sz w:val="20"/>
-        </w:rPr>
-        <w:t xml:space="preserve"> </w:t>
-      </w:r>
-      <w:r>
-        <w:rPr>
-          <w:sz w:val="20"/>
-        </w:rPr>
-        <w:t xml:space="preserve">“</w:t>
-      </w:r>
-      <w:r>
-        <w:rPr>
-          <w:sz w:val="20"/>
-        </w:rPr>
-        <w:t xml:space="preserve">linear-subspace</w:t>
-      </w:r>
-      <w:r>
-        <w:rPr>
-          <w:sz w:val="20"/>
-        </w:rPr>
-        <w:t xml:space="preserve">”</w:t>
-      </w:r>
-      <w:r>
-        <w:rPr>
-          <w:sz w:val="20"/>
-        </w:rPr>
-        <w:t xml:space="preserve"> </w:t>
-      </w:r>
-      <w:r>
-        <w:rPr>
-          <w:sz w:val="20"/>
-        </w:rPr>
-        <w:t xml:space="preserve">therefore mostly stands for</w:t>
-      </w:r>
-      <w:r>
-        <w:rPr>
-          <w:sz w:val="20"/>
-        </w:rPr>
-        <w:t xml:space="preserve"> </w:t>
-      </w:r>
-      <w:r>
-        <w:rPr>
-          <w:sz w:val="20"/>
-        </w:rPr>
-        <w:t xml:space="preserve">“</w:t>
-      </w:r>
-      <w:r>
-        <w:rPr>
-          <w:sz w:val="20"/>
-        </w:rPr>
-        <w:t xml:space="preserve">Gaussian-process regression with fitted hyper-parameters</w:t>
-      </w:r>
-      <w:r>
-        <w:rPr>
-          <w:sz w:val="20"/>
-        </w:rPr>
-        <w:t xml:space="preserve">”</w:t>
-      </w:r>
-      <w:r>
-        <w:rPr>
-          <w:sz w:val="20"/>
-        </w:rPr>
-        <w:t xml:space="preserve"> </w:t>
-      </w:r>
-      <w:r>
-        <w:rPr>
-          <w:sz w:val="20"/>
-        </w:rPr>
-        <w:t xml:space="preserve">in this benchmark.</w:t>
+        <w:t xml:space="preserve">per se</w:t>
+      </w:r>
+      <w:r>
+        <w:rPr>
+          <w:sz w:val="20"/>
+        </w:rPr>
+        <w:t xml:space="preserve"> </w:t>
+      </w:r>
+      <w:r>
+        <w:rPr>
+          <w:sz w:val="20"/>
+        </w:rPr>
+        <w:t xml:space="preserve">was not isolated (the GP’s continuous optimisation was not matched in cost by the 32-draw kernel-ridge search).</w:t>
       </w:r>
     </w:p>
     <w:p>
@@ -8383,9 +8737,9 @@
         </w:rPr>
         <w:drawing>
           <wp:inline>
-            <wp:extent cx="3200400" cy="2215661"/>
+            <wp:extent cx="3200400" cy="1800225"/>
             <wp:effectExtent b="0" l="0" r="0" t="0"/>
-            <wp:docPr descr="Figure 3. Mechanism controls in cells where POD+GP-ARD clearly beats the best neural network. Dashed line: 3× (the pre-registered tolerance). Left: matched-search kernel ridge (no marginal-likelihood fitting); middle: isotropic-kernel GP; right: GP on the full field without POD." title="" id="35" name="Picture"/>
+            <wp:docPr descr="Figure 3. Mechanism controls in cells where POD+GP-ARD clearly beats the best neural network. Dashed line: 3× (the pre-registered tolerance). From left: kernel ridge with the registered restricted ranges (B=8); kernel ridge with wide ranges (B=32, Exp H); isotropic-kernel GP; GP on the full field without POD." title="" id="35" name="Picture"/>
             <a:graphic>
               <a:graphicData uri="http://schemas.openxmlformats.org/drawingml/2006/picture">
                 <pic:pic>
@@ -8404,7 +8758,7 @@
                   <pic:spPr bwMode="auto">
                     <a:xfrm>
                       <a:off x="0" y="0"/>
-                      <a:ext cx="3200400" cy="2215661"/>
+                      <a:ext cx="3200400" cy="1800225"/>
                     </a:xfrm>
                     <a:prstGeom prst="rect">
                       <a:avLst/>
@@ -8431,7 +8785,7 @@
         <w:rPr>
           <w:sz w:val="20"/>
         </w:rPr>
-        <w:t xml:space="preserve">Figure 3. Mechanism controls in cells where POD+GP-ARD clearly beats the best neural network. Dashed line: 3× (the pre-registered tolerance). Left: matched-search kernel ridge (no marginal-likelihood fitting); middle: isotropic-kernel GP; right: GP on the full field without POD.</w:t>
+        <w:t xml:space="preserve">Figure 3. Mechanism controls in cells where POD+GP-ARD clearly beats the best neural network. Dashed line: 3× (the pre-registered tolerance). From left: kernel ridge with the registered restricted ranges (B=8); kernel ridge with wide ranges (B=32, Exp H); isotropic-kernel GP; GP on the full field without POD.</w:t>
       </w:r>
     </w:p>
     <w:tbl>
@@ -8444,10 +8798,10 @@
         <w:tblLayout w:type="fixed"/>
       </w:tblPr>
       <w:tblGrid>
-        <w:gridCol w:w="1123"/>
-        <w:gridCol w:w="3033"/>
-        <w:gridCol w:w="2022"/>
-        <w:gridCol w:w="1741"/>
+        <w:gridCol w:w="1355"/>
+        <w:gridCol w:w="1926"/>
+        <w:gridCol w:w="1462"/>
+        <w:gridCol w:w="3175"/>
       </w:tblGrid>
       <w:tr>
         <w:trPr>
@@ -8455,7 +8809,7 @@
         </w:trPr>
         <w:tc>
           <w:tcPr>
-            <w:tcW w:type="dxa" w:w="1483"/>
+            <w:tcW w:type="dxa" w:w="2239"/>
             <w:tcBorders>
               <w:top w:val="single" w:sz="4" w:color="BBBBBB"/>
               <w:bottom w:val="single" w:sz="4" w:color="BBBBBB"/>
@@ -8476,7 +8830,7 @@
         </w:tc>
         <w:tc>
           <w:tcPr>
-            <w:tcW w:type="dxa" w:w="3295"/>
+            <w:tcW w:type="dxa" w:w="2487"/>
             <w:tcBorders>
               <w:top w:val="single" w:sz="4" w:color="BBBBBB"/>
               <w:bottom w:val="single" w:sz="4" w:color="BBBBBB"/>
@@ -8497,7 +8851,7 @@
         </w:tc>
         <w:tc>
           <w:tcPr>
-            <w:tcW w:type="dxa" w:w="2801"/>
+            <w:tcW w:type="dxa" w:w="2425"/>
             <w:tcBorders>
               <w:top w:val="single" w:sz="4" w:color="BBBBBB"/>
               <w:bottom w:val="single" w:sz="4" w:color="BBBBBB"/>
@@ -8518,7 +8872,7 @@
         </w:tc>
         <w:tc>
           <w:tcPr>
-            <w:tcW w:type="dxa" w:w="2059"/>
+            <w:tcW w:type="dxa" w:w="2487"/>
             <w:tcBorders>
               <w:top w:val="single" w:sz="4" w:color="BBBBBB"/>
               <w:bottom w:val="single" w:sz="4" w:color="BBBBBB"/>
@@ -8541,7 +8895,7 @@
       <w:tr>
         <w:tc>
           <w:tcPr>
-            <w:tcW w:type="dxa" w:w="1483"/>
+            <w:tcW w:type="dxa" w:w="2239"/>
             <w:tcBorders>
               <w:top w:val="single" w:sz="4" w:color="BBBBBB"/>
               <w:bottom w:val="single" w:sz="4" w:color="BBBBBB"/>
@@ -8562,7 +8916,7 @@
         </w:tc>
         <w:tc>
           <w:tcPr>
-            <w:tcW w:type="dxa" w:w="3295"/>
+            <w:tcW w:type="dxa" w:w="2487"/>
             <w:tcBorders>
               <w:top w:val="single" w:sz="4" w:color="BBBBBB"/>
               <w:bottom w:val="single" w:sz="4" w:color="BBBBBB"/>
@@ -8583,7 +8937,7 @@
         </w:tc>
         <w:tc>
           <w:tcPr>
-            <w:tcW w:type="dxa" w:w="2801"/>
+            <w:tcW w:type="dxa" w:w="2425"/>
             <w:tcBorders>
               <w:top w:val="single" w:sz="4" w:color="BBBBBB"/>
               <w:bottom w:val="single" w:sz="4" w:color="BBBBBB"/>
@@ -8604,7 +8958,7 @@
         </w:tc>
         <w:tc>
           <w:tcPr>
-            <w:tcW w:type="dxa" w:w="2059"/>
+            <w:tcW w:type="dxa" w:w="2487"/>
             <w:tcBorders>
               <w:top w:val="single" w:sz="4" w:color="BBBBBB"/>
               <w:bottom w:val="single" w:sz="4" w:color="BBBBBB"/>
@@ -8641,7 +8995,7 @@
       <w:tr>
         <w:tc>
           <w:tcPr>
-            <w:tcW w:type="dxa" w:w="1483"/>
+            <w:tcW w:type="dxa" w:w="2239"/>
             <w:tcBorders>
               <w:top w:val="single" w:sz="4" w:color="BBBBBB"/>
               <w:bottom w:val="single" w:sz="4" w:color="BBBBBB"/>
@@ -8662,7 +9016,7 @@
         </w:tc>
         <w:tc>
           <w:tcPr>
-            <w:tcW w:type="dxa" w:w="3295"/>
+            <w:tcW w:type="dxa" w:w="2487"/>
             <w:tcBorders>
               <w:top w:val="single" w:sz="4" w:color="BBBBBB"/>
               <w:bottom w:val="single" w:sz="4" w:color="BBBBBB"/>
@@ -8683,7 +9037,7 @@
         </w:tc>
         <w:tc>
           <w:tcPr>
-            <w:tcW w:type="dxa" w:w="2801"/>
+            <w:tcW w:type="dxa" w:w="2425"/>
             <w:tcBorders>
               <w:top w:val="single" w:sz="4" w:color="BBBBBB"/>
               <w:bottom w:val="single" w:sz="4" w:color="BBBBBB"/>
@@ -8704,36 +9058,22 @@
         </w:tc>
         <w:tc>
           <w:tcPr>
-            <w:tcW w:type="dxa" w:w="2059"/>
-            <w:tcBorders>
-              <w:top w:val="single" w:sz="4" w:color="BBBBBB"/>
-              <w:bottom w:val="single" w:sz="4" w:color="BBBBBB"/>
-            </w:tcBorders>
-          </w:tcPr>
-          <w:p>
-            <w:pPr>
-              <w:pStyle w:val="Compact"/>
-              <w:jc w:val="left"/>
-            </w:pPr>
-            <w:r>
-              <w:rPr>
-                <w:bCs/>
-                <w:b/>
-                <w:sz w:val="15"/>
-              </w:rPr>
-              <w:t xml:space="preserve">M-MLII</w:t>
-            </w:r>
-            <w:r>
-              <w:rPr>
-                <w:sz w:val="15"/>
-              </w:rPr>
-              <w:t xml:space="preserve"> </w:t>
-            </w:r>
-            <w:r>
-              <w:rPr>
-                <w:sz w:val="15"/>
-              </w:rPr>
-              <w:t xml:space="preserve">(low-p cells only)</w:t>
+            <w:tcW w:type="dxa" w:w="2487"/>
+            <w:tcBorders>
+              <w:top w:val="single" w:sz="4" w:color="BBBBBB"/>
+              <w:bottom w:val="single" w:sz="4" w:color="BBBBBB"/>
+            </w:tcBorders>
+          </w:tcPr>
+          <w:p>
+            <w:pPr>
+              <w:pStyle w:val="Compact"/>
+              <w:jc w:val="left"/>
+            </w:pPr>
+            <w:r>
+              <w:rPr>
+                <w:sz w:val="15"/>
+              </w:rPr>
+              <w:t xml:space="preserve">M-MLII (rule met; low-p cells only; not an isolation of marginal likelihood, see Exp H)</w:t>
             </w:r>
           </w:p>
         </w:tc>
@@ -8741,7 +9081,179 @@
       <w:tr>
         <w:tc>
           <w:tcPr>
-            <w:tcW w:type="dxa" w:w="1483"/>
+            <w:tcW w:type="dxa" w:w="2239"/>
+            <w:tcBorders>
+              <w:top w:val="single" w:sz="4" w:color="BBBBBB"/>
+              <w:bottom w:val="single" w:sz="4" w:color="BBBBBB"/>
+            </w:tcBorders>
+          </w:tcPr>
+          <w:p>
+            <w:pPr>
+              <w:pStyle w:val="Compact"/>
+              <w:jc w:val="left"/>
+            </w:pPr>
+            <w:r>
+              <w:rPr>
+                <w:sz w:val="15"/>
+              </w:rPr>
+              <w:t xml:space="preserve">H8 (wide-range KRR, B=8; post hoc)</w:t>
+            </w:r>
+          </w:p>
+        </w:tc>
+        <w:tc>
+          <w:tcPr>
+            <w:tcW w:type="dxa" w:w="2487"/>
+            <w:tcBorders>
+              <w:top w:val="single" w:sz="4" w:color="BBBBBB"/>
+              <w:bottom w:val="single" w:sz="4" w:color="BBBBBB"/>
+            </w:tcBorders>
+          </w:tcPr>
+          <w:p>
+            <w:pPr>
+              <w:pStyle w:val="Compact"/>
+              <w:jc w:val="left"/>
+            </w:pPr>
+            <w:r>
+              <w:rPr>
+                <w:sz w:val="15"/>
+              </w:rPr>
+              <w:t xml:space="preserve">median err(KRR-wide)/err(POD+GP-ARD), GP-clear cells</w:t>
+            </w:r>
+          </w:p>
+        </w:tc>
+        <w:tc>
+          <w:tcPr>
+            <w:tcW w:type="dxa" w:w="2425"/>
+            <w:tcBorders>
+              <w:top w:val="single" w:sz="4" w:color="BBBBBB"/>
+              <w:bottom w:val="single" w:sz="4" w:color="BBBBBB"/>
+            </w:tcBorders>
+          </w:tcPr>
+          <w:p>
+            <w:pPr>
+              <w:pStyle w:val="Compact"/>
+              <w:jc w:val="left"/>
+            </w:pPr>
+            <w:r>
+              <w:rPr>
+                <w:sz w:val="15"/>
+              </w:rPr>
+              <w:t xml:space="preserve">6.5× (q25–q75 3.6–14.8; ≤3×: 21%; n=28)</w:t>
+            </w:r>
+          </w:p>
+        </w:tc>
+        <w:tc>
+          <w:tcPr>
+            <w:tcW w:type="dxa" w:w="2487"/>
+            <w:tcBorders>
+              <w:top w:val="single" w:sz="4" w:color="BBBBBB"/>
+              <w:bottom w:val="single" w:sz="4" w:color="BBBBBB"/>
+            </w:tcBorders>
+          </w:tcPr>
+          <w:p>
+            <w:pPr>
+              <w:pStyle w:val="Compact"/>
+              <w:jc w:val="left"/>
+            </w:pPr>
+            <w:r>
+              <w:rPr>
+                <w:sz w:val="15"/>
+              </w:rPr>
+              <w:t xml:space="preserve">mixed (neither H-RANGE nor H-MLII)</w:t>
+            </w:r>
+          </w:p>
+        </w:tc>
+      </w:tr>
+      <w:tr>
+        <w:tc>
+          <w:tcPr>
+            <w:tcW w:type="dxa" w:w="2239"/>
+            <w:tcBorders>
+              <w:top w:val="single" w:sz="4" w:color="BBBBBB"/>
+              <w:bottom w:val="single" w:sz="4" w:color="BBBBBB"/>
+            </w:tcBorders>
+          </w:tcPr>
+          <w:p>
+            <w:pPr>
+              <w:pStyle w:val="Compact"/>
+              <w:jc w:val="left"/>
+            </w:pPr>
+            <w:r>
+              <w:rPr>
+                <w:sz w:val="15"/>
+              </w:rPr>
+              <w:t xml:space="preserve">H32 (wide-range KRR, B=32; post hoc)</w:t>
+            </w:r>
+          </w:p>
+        </w:tc>
+        <w:tc>
+          <w:tcPr>
+            <w:tcW w:type="dxa" w:w="2487"/>
+            <w:tcBorders>
+              <w:top w:val="single" w:sz="4" w:color="BBBBBB"/>
+              <w:bottom w:val="single" w:sz="4" w:color="BBBBBB"/>
+            </w:tcBorders>
+          </w:tcPr>
+          <w:p>
+            <w:pPr>
+              <w:pStyle w:val="Compact"/>
+              <w:jc w:val="left"/>
+            </w:pPr>
+            <w:r>
+              <w:rPr>
+                <w:sz w:val="15"/>
+              </w:rPr>
+              <w:t xml:space="preserve">same</w:t>
+            </w:r>
+          </w:p>
+        </w:tc>
+        <w:tc>
+          <w:tcPr>
+            <w:tcW w:type="dxa" w:w="2425"/>
+            <w:tcBorders>
+              <w:top w:val="single" w:sz="4" w:color="BBBBBB"/>
+              <w:bottom w:val="single" w:sz="4" w:color="BBBBBB"/>
+            </w:tcBorders>
+          </w:tcPr>
+          <w:p>
+            <w:pPr>
+              <w:pStyle w:val="Compact"/>
+              <w:jc w:val="left"/>
+            </w:pPr>
+            <w:r>
+              <w:rPr>
+                <w:sz w:val="15"/>
+              </w:rPr>
+              <w:t xml:space="preserve">2.7× (q25–q75 1.9–4.4; ≤3×: 57%)</w:t>
+            </w:r>
+          </w:p>
+        </w:tc>
+        <w:tc>
+          <w:tcPr>
+            <w:tcW w:type="dxa" w:w="2487"/>
+            <w:tcBorders>
+              <w:top w:val="single" w:sz="4" w:color="BBBBBB"/>
+              <w:bottom w:val="single" w:sz="4" w:color="BBBBBB"/>
+            </w:tcBorders>
+          </w:tcPr>
+          <w:p>
+            <w:pPr>
+              <w:pStyle w:val="Compact"/>
+              <w:jc w:val="left"/>
+            </w:pPr>
+            <w:r>
+              <w:rPr>
+                <w:sz w:val="15"/>
+              </w:rPr>
+              <w:t xml:space="preserve">mixed (median ≤3 but only 57% of cells ≤3)</w:t>
+            </w:r>
+          </w:p>
+        </w:tc>
+      </w:tr>
+      <w:tr>
+        <w:tc>
+          <w:tcPr>
+            <w:tcW w:type="dxa" w:w="2239"/>
             <w:tcBorders>
               <w:top w:val="single" w:sz="4" w:color="BBBBBB"/>
               <w:bottom w:val="single" w:sz="4" w:color="BBBBBB"/>
@@ -8762,7 +9274,7 @@
         </w:tc>
         <w:tc>
           <w:tcPr>
-            <w:tcW w:type="dxa" w:w="3295"/>
+            <w:tcW w:type="dxa" w:w="2487"/>
             <w:tcBorders>
               <w:top w:val="single" w:sz="4" w:color="BBBBBB"/>
               <w:bottom w:val="single" w:sz="4" w:color="BBBBBB"/>
@@ -8783,7 +9295,7 @@
         </w:tc>
         <w:tc>
           <w:tcPr>
-            <w:tcW w:type="dxa" w:w="2801"/>
+            <w:tcW w:type="dxa" w:w="2425"/>
             <w:tcBorders>
               <w:top w:val="single" w:sz="4" w:color="BBBBBB"/>
               <w:bottom w:val="single" w:sz="4" w:color="BBBBBB"/>
@@ -8804,7 +9316,7 @@
         </w:tc>
         <w:tc>
           <w:tcPr>
-            <w:tcW w:type="dxa" w:w="2059"/>
+            <w:tcW w:type="dxa" w:w="2487"/>
             <w:tcBorders>
               <w:top w:val="single" w:sz="4" w:color="BBBBBB"/>
               <w:bottom w:val="single" w:sz="4" w:color="BBBBBB"/>
@@ -8849,7 +9361,468 @@
           <w:i/>
           <w:sz w:val="20"/>
         </w:rPr>
-        <w:t xml:space="preserve">Table 4. Mechanism experiments (all post hoc in motivation; criteria registered before the runs).</w:t>
+        <w:t xml:space="preserve">Table 4a. Mechanism experiments. All are post hoc in motivation; criteria were registered before each run. Cells are pooled (instance, N) cells selected by an oracle comparator (best network by test error), and are not independent (28–52 cells from 13–14 instances).</w:t>
+      </w:r>
+    </w:p>
+    <w:tbl>
+      <w:tblPr>
+        <w:tblStyle w:val="Table"/>
+        <w:tblW w:type="pct" w:w="5000"/>
+        <w:jc w:val="center"/>
+        <w:tblLayout w:type="fixed"/>
+        <w:tblLook w:firstRow="1" w:lastRow="0" w:firstColumn="0" w:lastColumn="0" w:noHBand="0" w:noVBand="0" w:val="0020"/>
+        <w:tblLayout w:type="fixed"/>
+      </w:tblPr>
+      <w:tblGrid>
+        <w:gridCol w:w="448"/>
+        <w:gridCol w:w="1494"/>
+        <w:gridCol w:w="1494"/>
+        <w:gridCol w:w="2241"/>
+        <w:gridCol w:w="2241"/>
+      </w:tblGrid>
+      <w:tr>
+        <w:trPr>
+          <w:tblHeader w:val="true"/>
+        </w:trPr>
+        <w:tc>
+          <w:tcPr>
+            <w:tcW w:type="dxa" w:w="741"/>
+            <w:tcBorders>
+              <w:top w:val="single" w:sz="4" w:color="BBBBBB"/>
+              <w:bottom w:val="single" w:sz="4" w:color="BBBBBB"/>
+            </w:tcBorders>
+          </w:tcPr>
+          <w:p>
+            <w:pPr>
+              <w:pStyle w:val="Compact"/>
+              <w:jc w:val="right"/>
+            </w:pPr>
+            <w:r>
+              <w:rPr>
+                <w:sz w:val="15"/>
+              </w:rPr>
+              <w:t xml:space="preserve">N</w:t>
+            </w:r>
+          </w:p>
+        </w:tc>
+        <w:tc>
+          <w:tcPr>
+            <w:tcW w:type="dxa" w:w="1695"/>
+            <w:tcBorders>
+              <w:top w:val="single" w:sz="4" w:color="BBBBBB"/>
+              <w:bottom w:val="single" w:sz="4" w:color="BBBBBB"/>
+            </w:tcBorders>
+          </w:tcPr>
+          <w:p>
+            <w:pPr>
+              <w:pStyle w:val="Compact"/>
+              <w:jc w:val="right"/>
+            </w:pPr>
+            <w:r>
+              <w:rPr>
+                <w:sz w:val="15"/>
+              </w:rPr>
+              <w:t xml:space="preserve">POD+GP: GP-clear</w:t>
+            </w:r>
+          </w:p>
+        </w:tc>
+        <w:tc>
+          <w:tcPr>
+            <w:tcW w:type="dxa" w:w="1695"/>
+            <w:tcBorders>
+              <w:top w:val="single" w:sz="4" w:color="BBBBBB"/>
+              <w:bottom w:val="single" w:sz="4" w:color="BBBBBB"/>
+            </w:tcBorders>
+          </w:tcPr>
+          <w:p>
+            <w:pPr>
+              <w:pStyle w:val="Compact"/>
+              <w:jc w:val="right"/>
+            </w:pPr>
+            <w:r>
+              <w:rPr>
+                <w:sz w:val="15"/>
+              </w:rPr>
+              <w:t xml:space="preserve">POD+GP: NN-clear</w:t>
+            </w:r>
+          </w:p>
+        </w:tc>
+        <w:tc>
+          <w:tcPr>
+            <w:tcW w:type="dxa" w:w="2754"/>
+            <w:tcBorders>
+              <w:top w:val="single" w:sz="4" w:color="BBBBBB"/>
+              <w:bottom w:val="single" w:sz="4" w:color="BBBBBB"/>
+            </w:tcBorders>
+          </w:tcPr>
+          <w:p>
+            <w:pPr>
+              <w:pStyle w:val="Compact"/>
+              <w:jc w:val="right"/>
+            </w:pPr>
+            <w:r>
+              <w:rPr>
+                <w:sz w:val="15"/>
+              </w:rPr>
+              <w:t xml:space="preserve">GP on full field: GP-clear</w:t>
+            </w:r>
+          </w:p>
+        </w:tc>
+        <w:tc>
+          <w:tcPr>
+            <w:tcW w:type="dxa" w:w="2754"/>
+            <w:tcBorders>
+              <w:top w:val="single" w:sz="4" w:color="BBBBBB"/>
+              <w:bottom w:val="single" w:sz="4" w:color="BBBBBB"/>
+            </w:tcBorders>
+          </w:tcPr>
+          <w:p>
+            <w:pPr>
+              <w:pStyle w:val="Compact"/>
+              <w:jc w:val="right"/>
+            </w:pPr>
+            <w:r>
+              <w:rPr>
+                <w:sz w:val="15"/>
+              </w:rPr>
+              <w:t xml:space="preserve">GP on full field: NN-clear</w:t>
+            </w:r>
+          </w:p>
+        </w:tc>
+      </w:tr>
+      <w:tr>
+        <w:tc>
+          <w:tcPr>
+            <w:tcW w:type="dxa" w:w="741"/>
+            <w:tcBorders>
+              <w:top w:val="single" w:sz="4" w:color="BBBBBB"/>
+              <w:bottom w:val="single" w:sz="4" w:color="BBBBBB"/>
+            </w:tcBorders>
+          </w:tcPr>
+          <w:p>
+            <w:pPr>
+              <w:pStyle w:val="Compact"/>
+              <w:jc w:val="right"/>
+            </w:pPr>
+            <w:r>
+              <w:rPr>
+                <w:sz w:val="15"/>
+              </w:rPr>
+              <w:t xml:space="preserve">64</w:t>
+            </w:r>
+          </w:p>
+        </w:tc>
+        <w:tc>
+          <w:tcPr>
+            <w:tcW w:type="dxa" w:w="1695"/>
+            <w:tcBorders>
+              <w:top w:val="single" w:sz="4" w:color="BBBBBB"/>
+              <w:bottom w:val="single" w:sz="4" w:color="BBBBBB"/>
+            </w:tcBorders>
+          </w:tcPr>
+          <w:p>
+            <w:pPr>
+              <w:pStyle w:val="Compact"/>
+              <w:jc w:val="right"/>
+            </w:pPr>
+            <w:r>
+              <w:rPr>
+                <w:sz w:val="15"/>
+              </w:rPr>
+              <w:t xml:space="preserve">7</w:t>
+            </w:r>
+          </w:p>
+        </w:tc>
+        <w:tc>
+          <w:tcPr>
+            <w:tcW w:type="dxa" w:w="1695"/>
+            <w:tcBorders>
+              <w:top w:val="single" w:sz="4" w:color="BBBBBB"/>
+              <w:bottom w:val="single" w:sz="4" w:color="BBBBBB"/>
+            </w:tcBorders>
+          </w:tcPr>
+          <w:p>
+            <w:pPr>
+              <w:pStyle w:val="Compact"/>
+              <w:jc w:val="right"/>
+            </w:pPr>
+            <w:r>
+              <w:rPr>
+                <w:sz w:val="15"/>
+              </w:rPr>
+              <w:t xml:space="preserve">13</w:t>
+            </w:r>
+          </w:p>
+        </w:tc>
+        <w:tc>
+          <w:tcPr>
+            <w:tcW w:type="dxa" w:w="2754"/>
+            <w:tcBorders>
+              <w:top w:val="single" w:sz="4" w:color="BBBBBB"/>
+              <w:bottom w:val="single" w:sz="4" w:color="BBBBBB"/>
+            </w:tcBorders>
+          </w:tcPr>
+          <w:p>
+            <w:pPr>
+              <w:pStyle w:val="Compact"/>
+              <w:jc w:val="right"/>
+            </w:pPr>
+            <w:r>
+              <w:rPr>
+                <w:sz w:val="15"/>
+              </w:rPr>
+              <w:t xml:space="preserve">9</w:t>
+            </w:r>
+          </w:p>
+        </w:tc>
+        <w:tc>
+          <w:tcPr>
+            <w:tcW w:type="dxa" w:w="2754"/>
+            <w:tcBorders>
+              <w:top w:val="single" w:sz="4" w:color="BBBBBB"/>
+              <w:bottom w:val="single" w:sz="4" w:color="BBBBBB"/>
+            </w:tcBorders>
+          </w:tcPr>
+          <w:p>
+            <w:pPr>
+              <w:pStyle w:val="Compact"/>
+              <w:jc w:val="right"/>
+            </w:pPr>
+            <w:r>
+              <w:rPr>
+                <w:sz w:val="15"/>
+              </w:rPr>
+              <w:t xml:space="preserve">7</w:t>
+            </w:r>
+          </w:p>
+        </w:tc>
+      </w:tr>
+      <w:tr>
+        <w:tc>
+          <w:tcPr>
+            <w:tcW w:type="dxa" w:w="741"/>
+            <w:tcBorders>
+              <w:top w:val="single" w:sz="4" w:color="BBBBBB"/>
+              <w:bottom w:val="single" w:sz="4" w:color="BBBBBB"/>
+            </w:tcBorders>
+          </w:tcPr>
+          <w:p>
+            <w:pPr>
+              <w:pStyle w:val="Compact"/>
+              <w:jc w:val="right"/>
+            </w:pPr>
+            <w:r>
+              <w:rPr>
+                <w:sz w:val="15"/>
+              </w:rPr>
+              <w:t xml:space="preserve">256</w:t>
+            </w:r>
+          </w:p>
+        </w:tc>
+        <w:tc>
+          <w:tcPr>
+            <w:tcW w:type="dxa" w:w="1695"/>
+            <w:tcBorders>
+              <w:top w:val="single" w:sz="4" w:color="BBBBBB"/>
+              <w:bottom w:val="single" w:sz="4" w:color="BBBBBB"/>
+            </w:tcBorders>
+          </w:tcPr>
+          <w:p>
+            <w:pPr>
+              <w:pStyle w:val="Compact"/>
+              <w:jc w:val="right"/>
+            </w:pPr>
+            <w:r>
+              <w:rPr>
+                <w:sz w:val="15"/>
+              </w:rPr>
+              <w:t xml:space="preserve">9</w:t>
+            </w:r>
+          </w:p>
+        </w:tc>
+        <w:tc>
+          <w:tcPr>
+            <w:tcW w:type="dxa" w:w="1695"/>
+            <w:tcBorders>
+              <w:top w:val="single" w:sz="4" w:color="BBBBBB"/>
+              <w:bottom w:val="single" w:sz="4" w:color="BBBBBB"/>
+            </w:tcBorders>
+          </w:tcPr>
+          <w:p>
+            <w:pPr>
+              <w:pStyle w:val="Compact"/>
+              <w:jc w:val="right"/>
+            </w:pPr>
+            <w:r>
+              <w:rPr>
+                <w:sz w:val="15"/>
+              </w:rPr>
+              <w:t xml:space="preserve">8</w:t>
+            </w:r>
+          </w:p>
+        </w:tc>
+        <w:tc>
+          <w:tcPr>
+            <w:tcW w:type="dxa" w:w="2754"/>
+            <w:tcBorders>
+              <w:top w:val="single" w:sz="4" w:color="BBBBBB"/>
+              <w:bottom w:val="single" w:sz="4" w:color="BBBBBB"/>
+            </w:tcBorders>
+          </w:tcPr>
+          <w:p>
+            <w:pPr>
+              <w:pStyle w:val="Compact"/>
+              <w:jc w:val="right"/>
+            </w:pPr>
+            <w:r>
+              <w:rPr>
+                <w:sz w:val="15"/>
+              </w:rPr>
+              <w:t xml:space="preserve">15</w:t>
+            </w:r>
+          </w:p>
+        </w:tc>
+        <w:tc>
+          <w:tcPr>
+            <w:tcW w:type="dxa" w:w="2754"/>
+            <w:tcBorders>
+              <w:top w:val="single" w:sz="4" w:color="BBBBBB"/>
+              <w:bottom w:val="single" w:sz="4" w:color="BBBBBB"/>
+            </w:tcBorders>
+          </w:tcPr>
+          <w:p>
+            <w:pPr>
+              <w:pStyle w:val="Compact"/>
+              <w:jc w:val="right"/>
+            </w:pPr>
+            <w:r>
+              <w:rPr>
+                <w:sz w:val="15"/>
+              </w:rPr>
+              <w:t xml:space="preserve">6</w:t>
+            </w:r>
+          </w:p>
+        </w:tc>
+      </w:tr>
+      <w:tr>
+        <w:tc>
+          <w:tcPr>
+            <w:tcW w:type="dxa" w:w="741"/>
+            <w:tcBorders>
+              <w:top w:val="single" w:sz="4" w:color="BBBBBB"/>
+              <w:bottom w:val="single" w:sz="4" w:color="BBBBBB"/>
+            </w:tcBorders>
+          </w:tcPr>
+          <w:p>
+            <w:pPr>
+              <w:pStyle w:val="Compact"/>
+              <w:jc w:val="right"/>
+            </w:pPr>
+            <w:r>
+              <w:rPr>
+                <w:sz w:val="15"/>
+              </w:rPr>
+              <w:t xml:space="preserve">1024</w:t>
+            </w:r>
+          </w:p>
+        </w:tc>
+        <w:tc>
+          <w:tcPr>
+            <w:tcW w:type="dxa" w:w="1695"/>
+            <w:tcBorders>
+              <w:top w:val="single" w:sz="4" w:color="BBBBBB"/>
+              <w:bottom w:val="single" w:sz="4" w:color="BBBBBB"/>
+            </w:tcBorders>
+          </w:tcPr>
+          <w:p>
+            <w:pPr>
+              <w:pStyle w:val="Compact"/>
+              <w:jc w:val="right"/>
+            </w:pPr>
+            <w:r>
+              <w:rPr>
+                <w:sz w:val="15"/>
+              </w:rPr>
+              <w:t xml:space="preserve">12</w:t>
+            </w:r>
+          </w:p>
+        </w:tc>
+        <w:tc>
+          <w:tcPr>
+            <w:tcW w:type="dxa" w:w="1695"/>
+            <w:tcBorders>
+              <w:top w:val="single" w:sz="4" w:color="BBBBBB"/>
+              <w:bottom w:val="single" w:sz="4" w:color="BBBBBB"/>
+            </w:tcBorders>
+          </w:tcPr>
+          <w:p>
+            <w:pPr>
+              <w:pStyle w:val="Compact"/>
+              <w:jc w:val="right"/>
+            </w:pPr>
+            <w:r>
+              <w:rPr>
+                <w:sz w:val="15"/>
+              </w:rPr>
+              <w:t xml:space="preserve">9</w:t>
+            </w:r>
+          </w:p>
+        </w:tc>
+        <w:tc>
+          <w:tcPr>
+            <w:tcW w:type="dxa" w:w="2754"/>
+            <w:tcBorders>
+              <w:top w:val="single" w:sz="4" w:color="BBBBBB"/>
+              <w:bottom w:val="single" w:sz="4" w:color="BBBBBB"/>
+            </w:tcBorders>
+          </w:tcPr>
+          <w:p>
+            <w:pPr>
+              <w:pStyle w:val="Compact"/>
+              <w:jc w:val="right"/>
+            </w:pPr>
+            <w:r>
+              <w:rPr>
+                <w:sz w:val="15"/>
+              </w:rPr>
+              <w:t xml:space="preserve">18</w:t>
+            </w:r>
+          </w:p>
+        </w:tc>
+        <w:tc>
+          <w:tcPr>
+            <w:tcW w:type="dxa" w:w="2754"/>
+            <w:tcBorders>
+              <w:top w:val="single" w:sz="4" w:color="BBBBBB"/>
+              <w:bottom w:val="single" w:sz="4" w:color="BBBBBB"/>
+            </w:tcBorders>
+          </w:tcPr>
+          <w:p>
+            <w:pPr>
+              <w:pStyle w:val="Compact"/>
+              <w:jc w:val="right"/>
+            </w:pPr>
+            <w:r>
+              <w:rPr>
+                <w:sz w:val="15"/>
+              </w:rPr>
+              <w:t xml:space="preserve">5</w:t>
+            </w:r>
+          </w:p>
+        </w:tc>
+      </w:tr>
+    </w:tbl>
+    <w:p>
+      <w:pPr>
+        <w:pStyle w:val="BodyText"/>
+      </w:pPr>
+      <w:r>
+        <w:rPr>
+          <w:iCs/>
+          <w:i/>
+          <w:sz w:val="20"/>
+        </w:rPr>
+        <w:t xml:space="preserve">Table 4b. Exp G, all 72 cells (24 instances × N ∈ {64, 256, 1024}): clear wins (tie band 0.10) of each GP variant against the best network (oracle comparator).</w:t>
       </w:r>
     </w:p>
     <w:bookmarkEnd w:id="37"/>
@@ -9187,50 +10160,6 @@
               <w:rPr>
                 <w:sz w:val="15"/>
               </w:rPr>
-              <w:t xml:space="preserve">NN search-space boundary (selected configs at an edge)</w:t>
-            </w:r>
-          </w:p>
-        </w:tc>
-        <w:tc>
-          <w:tcPr>
-            <w:tcW w:type="dxa" w:w="4819"/>
-            <w:tcBorders>
-              <w:top w:val="single" w:sz="4" w:color="BBBBBB"/>
-              <w:bottom w:val="single" w:sz="4" w:color="BBBBBB"/>
-            </w:tcBorders>
-          </w:tcPr>
-          <w:p>
-            <w:pPr>
-              <w:pStyle w:val="Compact"/>
-              <w:jc w:val="left"/>
-            </w:pPr>
-            <w:r>
-              <w:rPr>
-                <w:sz w:val="15"/>
-              </w:rPr>
-              <w:t xml:space="preserve">73% of 1296 selected configs; 72% in LS-clear cells vs 74% elsewhere</w:t>
-            </w:r>
-          </w:p>
-        </w:tc>
-      </w:tr>
-      <w:tr>
-        <w:tc>
-          <w:tcPr>
-            <w:tcW w:type="dxa" w:w="4819"/>
-            <w:tcBorders>
-              <w:top w:val="single" w:sz="4" w:color="BBBBBB"/>
-              <w:bottom w:val="single" w:sz="4" w:color="BBBBBB"/>
-            </w:tcBorders>
-          </w:tcPr>
-          <w:p>
-            <w:pPr>
-              <w:pStyle w:val="Compact"/>
-              <w:jc w:val="left"/>
-            </w:pPr>
-            <w:r>
-              <w:rPr>
-                <w:sz w:val="15"/>
-              </w:rPr>
               <w:t xml:space="preserve">Exp B: 4× epochs (6000 vs 1500), N∈{256,1024}</w:t>
             </w:r>
           </w:p>
@@ -9268,7 +10197,7 @@
           <w:i/>
           <w:sz w:val="20"/>
         </w:rPr>
-        <w:t xml:space="preserve">Table 5. Robustness checks. The first six rows are analysis-only; the Exp B row refits stored configurations.</w:t>
+        <w:t xml:space="preserve">Table 5. Robustness checks. Rows 1–6 are analysis-only; the Exp B row refits stored configurations (Exp B classes use the best of each family by test error, which differs from validation-selected classes by at most 0.24 decade).</w:t>
       </w:r>
     </w:p>
     <w:p>
@@ -9279,33 +10208,7 @@
         <w:rPr>
           <w:sz w:val="20"/>
         </w:rPr>
-        <w:t xml:space="preserve">Two results deserve emphasis. First, the class of a cell is only moderately reproducible under a different random-search draw: even and odd search trials give the same class in 83% of cells, though the sign of clear cells agrees in 99%; conclusions about individual</w:t>
-      </w:r>
-      <w:r>
-        <w:rPr>
-          <w:sz w:val="20"/>
-        </w:rPr>
-        <w:t xml:space="preserve"> </w:t>
-      </w:r>
-      <w:r>
-        <w:rPr>
-          <w:iCs/>
-          <w:i/>
-          <w:sz w:val="20"/>
-        </w:rPr>
-        <w:t xml:space="preserve">ties</w:t>
-      </w:r>
-      <w:r>
-        <w:rPr>
-          <w:sz w:val="20"/>
-        </w:rPr>
-        <w:t xml:space="preserve"> </w:t>
-      </w:r>
-      <w:r>
-        <w:rPr>
-          <w:sz w:val="20"/>
-        </w:rPr>
-        <w:t xml:space="preserve">are fragile, conclusions about large gaps are not. Second,</w:t>
+        <w:t xml:space="preserve">Three results deserve emphasis. First, class labels are only moderately reproducible under a different random-search draw: even and odd search trials (4 trials each; the even half contains the default trial) give the same class in 83% of cells, the sign of clear cells agreeing in 99%; given that draws are shared across instances (above), this under-states the uncertainty of the tuning procedure. Conclusions about individual ties are fragile, those about large gaps much less so. Second,</w:t>
       </w:r>
       <w:r>
         <w:rPr>
@@ -9319,13 +10222,13 @@
           <w:b/>
           <w:sz w:val="20"/>
         </w:rPr>
-        <w:t xml:space="preserve">the neural error floor is partly a budget effect</w:t>
-      </w:r>
-      <w:r>
-        <w:rPr>
-          <w:sz w:val="20"/>
-        </w:rPr>
-        <w:t xml:space="preserve">. Training four times longer (Exp B) satisfies both pre-registered criteria (sign retained in 88% of clear cells; median shift toward the neural family 0.24 decade), but it moves ȳ systematically toward the neural family, changes the class of 15 of 48 cells (nine ties become neural-clear), and improves 90% of the refits. The headline of large linear-subspace wins in smooth cells is robust to this (bratu remains ≈ 2.6–2.9 decades), whereas the tie/neural-win boundary is not.</w:t>
+        <w:t xml:space="preserve">the neural error floor is partly a training-budget effect</w:t>
+      </w:r>
+      <w:r>
+        <w:rPr>
+          <w:sz w:val="20"/>
+        </w:rPr>
+        <w:t xml:space="preserve">. Training four times longer (Exp B) satisfies both pre-registered criteria (sign retained in 88% of clear cells; median shift toward the neural family 0.24 decade), but it moves ȳ toward the neural family in every one of the 15 cells whose class changes (of 48; nine ties become neural-clear) and improves 90% of the refits.</w:t>
       </w:r>
       <w:r>
         <w:rPr>
@@ -9371,7 +10274,13 @@
         <w:rPr>
           <w:sz w:val="20"/>
         </w:rPr>
-        <w:t xml:space="preserve">. The instances that fall below one decade are darcy_L1, heat2d_L1, none reverses to a neural win. The oracle-best variant is chosen using test error, which favours the neural family by design. The smallest neural error reached falls from 6.8e-04 to 2.0e-04.</w:t>
+        <w:t xml:space="preserve"> </w:t>
+      </w:r>
+      <w:r>
+        <w:rPr>
+          <w:sz w:val="20"/>
+        </w:rPr>
+        <w:t xml:space="preserve">— i.e. the large gaps were not overturned by the tested refits (float64, 6000 full-batch Adam steps, L-BFGS capped at 400 iterations, which changed the training loss by &lt;1% in 21% of refits), not that they are independent of the optimiser. The instances that fall below one decade are darcy_L1, heat2d_L1, none reverses to a neural win. The oracle-best variant is chosen using test error, which favours the neural family by design. The smallest neural error reached falls from 6.8e-04 to 2.0e-04. Third, the neural error at N = 1024 sits at about 5·10⁻⁴–10⁻³ in 11 of the 12 instances with ȳ &gt; 2 irrespective of the problem, which points to a training limit rather than to the approximability of the map; Exp F reduced it only to about 2·10⁻⁴.</w:t>
       </w:r>
     </w:p>
     <w:bookmarkEnd w:id="38"/>
@@ -9395,7 +10304,33 @@
         <w:rPr>
           <w:sz w:val="20"/>
         </w:rPr>
-        <w:t xml:space="preserve">In the Stage-1 test of unequal tuning, giving the neural family 8 trials and the linear-subspace family 1 changed the winner in 10 cells in the direction of the neural family and in 1 in the other (exact McNemar p = 0.006; neural-win share 47% → 56%). This is a cell-level test; at the instance level only 5 of 16 instances contribute any flip (Wilcoxon p = 0.031). We read it as direction-consistent evidence that asymmetric tuning favours whichever side is tuned more, not as a precise effect size.</w:t>
+        <w:t xml:space="preserve">In the Stage-1 test of unequal tuning, giving the neural family 8 trials and the linear-subspace family 1 changed the winner in 10 cells in the direction of the neural family and in 1 in the other (exact one-sided binomial/McNemar p = 0.006; neural-win share 47% → 56%). This is a cell-level test on 11 discordant cells out of 96; at the instance level only 5 of 16 instances contribute any flip (Wilcoxon p = 0.031). We read it as direction-consistent evidence that</w:t>
+      </w:r>
+      <w:r>
+        <w:rPr>
+          <w:sz w:val="20"/>
+        </w:rPr>
+        <w:t xml:space="preserve"> </w:t>
+      </w:r>
+      <w:r>
+        <w:rPr>
+          <w:iCs/>
+          <w:i/>
+          <w:sz w:val="20"/>
+        </w:rPr>
+        <w:t xml:space="preserve">tuning the neural family more than the linear-subspace family</w:t>
+      </w:r>
+      <w:r>
+        <w:rPr>
+          <w:sz w:val="20"/>
+        </w:rPr>
+        <w:t xml:space="preserve"> </w:t>
+      </w:r>
+      <w:r>
+        <w:rPr>
+          <w:sz w:val="20"/>
+        </w:rPr>
+        <w:t xml:space="preserve">moves the comparison toward the neural family; the converse asymmetry was not tested.</w:t>
       </w:r>
       <w:r>
         <w:rPr>
@@ -9431,7 +10366,7 @@
         <w:rPr>
           <w:sz w:val="20"/>
         </w:rPr>
-        <w:t xml:space="preserve">counts trials, not coverage of the respective search spaces: the POD+GP search has only 8 discrete points and its marginal-likelihood optimisation is not counted in B, whereas the neural search is continuous in several dimensions; and 73% of the selected neural configurations lie at an edge of their search space.</w:t>
+        <w:t xml:space="preserve">counts trials, not coverage of the search spaces: the POD+GP search has only 8 discrete points and its marginal-likelihood optimisation is not counted in B, whereas the neural search is continuous in several dimensions, and Exp H shows that the outcome for kernel ridge depends strongly on the range and resolution of the search. The linear-subspace family also selects among three methods and the neural family among two.</w:t>
       </w:r>
     </w:p>
     <w:bookmarkEnd w:id="39"/>
@@ -9470,7 +10405,7 @@
         <w:rPr>
           <w:sz w:val="20"/>
         </w:rPr>
-        <w:t xml:space="preserve">(i) In this suite of 36 synthetic instances, the best Gaussian-process reduced model is far more accurate than float32 networks trained for 1500 epochs on smooth, low-dimensional maps, at training budgets of 256–1024 solves, and the advantage is reproduced in 7 of 7 pre-selected new smooth instances. (ii) The advantage is largely due to marginal-likelihood fitting of the regressor, and does not need the POD basis. (iii) Neural networks are competitive or better on problems with moving or discontinuous features and in some high-dimensional parameter spaces, and at small N most cells are ties. (iv) The classification of a cell is sensitive to the neural training budget and, for ties, to the random-search draw.</w:t>
+        <w:t xml:space="preserve">(i) In this suite of 36 synthetic instances, a Gaussian-process reduced model is far more accurate than float32 networks trained for 1500 epochs on smooth, low-dimensional maps at 256–1024 training solves, and this was reproduced on 7 of 7 pre-selected smooth instances (which are, however, from four related families and mostly p = 3). (ii) The advantage is not due to the POD basis (a no-POD GP matches or beats it) and is largely a hyper-parameter-search effect: a kernel regressor with a wide, finely searched ridge range closes most of the gap, whereas the registered, narrower control did not. (iii) Where networks win against the POD+GP pipeline (moving or discontinuous features, some high-p problems), a no-POD GP often wins again, so those cells are not clean evidence for neural superiority either. (iv) The class of a cell is sensitive to the neural training budget and, for ties, to the random-search draw.</w:t>
       </w:r>
     </w:p>
     <w:p>
@@ -9495,7 +10430,7 @@
         <w:rPr>
           <w:sz w:val="20"/>
         </w:rPr>
-        <w:t xml:space="preserve">We could not confirm that a pilot-data statistic predicts the winner on unseen instances (inconclusive at 8 instances), nor that learning curves cross as data grow (confounded with step count). We make no claim about real-world application problems, about operator-learning architectures (FNO, DeepONet), about tuned optimisers beyond the checks reported, or about problems with p ≳ 10 where Exp E is uninformative.</w:t>
+        <w:t xml:space="preserve">A pilot-data statistic that predicts the winner on unseen instances (inconclusive at 8 instances); learning-curve crossovers (step-count confound); an isolation of marginal likelihood as the mechanism; any statement about real-world problems, operator-learning architectures (FNO, DeepONet), well-tuned deep networks, or problems with p ≳ 10, where the mechanism controls are uninformative.</w:t>
       </w:r>
     </w:p>
     <w:p>
@@ -9520,7 +10455,7 @@
         <w:rPr>
           <w:sz w:val="20"/>
         </w:rPr>
-        <w:t xml:space="preserve">The competitiveness of kernel/GP methods [Batlle et al. 2024], the advantage of GP regression over a neural network in a POD framework [Bērziņš et al. 2020] and the absence of a universal winner [Westermann et al. 2026] are known. Our contribution is a quantified, tie-aware map under a common protocol, controls that attribute the GP advantage to hyper-parameter fitting rather than to the subspace or anisotropy, and an explicit report of how far the answer moves with tuning symmetry, training budget and the draw of random-search configurations. We do not claim to be the first to observe that GP beats a network on smooth problems.</w:t>
+        <w:t xml:space="preserve">The competitiveness of kernel/GP methods [Batlle et al. 2024], the advantage of GP regression over a neural network in a POD framework [Bērziņš et al. 2020] and the absence of a universal winner [Westermann et al. 2026] are known. Our contribution is a quantified, tie-aware map under a common protocol, controls that locate the advantage in the regressor and its hyper-parameter search rather than in the subspace, and an explicit report of how far the answer moves with tuning symmetry, training budget and search draw, including a case in which a registered control turned out to be too weak. We do not claim to be the first to observe that a GP beats a network on smooth problems.</w:t>
       </w:r>
     </w:p>
     <w:bookmarkEnd w:id="41"/>
@@ -9552,7 +10487,7 @@
         <w:rPr>
           <w:sz w:val="20"/>
         </w:rPr>
-        <w:t xml:space="preserve">; 36 instances in 15 families, several of them small (1-D/2-D, 128–256 outputs), solved by in-house solvers verified by manufactured solutions but not by a third-party code.</w:t>
+        <w:t xml:space="preserve">; 36 instances in 19 family labels, several of them small (1-D/2-D, 128–256 outputs), solved by in-house solvers verified by manufactured solutions but not by third-party codes.</w:t>
       </w:r>
       <w:r>
         <w:rPr>
@@ -9566,13 +10501,13 @@
           <w:i/>
           <w:sz w:val="20"/>
         </w:rPr>
-        <w:t xml:space="preserve">Two families of methods only</w:t>
-      </w:r>
-      <w:r>
-        <w:rPr>
-          <w:sz w:val="20"/>
-        </w:rPr>
-        <w:t xml:space="preserve">, five main methods plus three controls; no operator-learning networks, no ensembles, no second-order optimisers in the main protocol.</w:t>
+        <w:t xml:space="preserve">Few methods</w:t>
+      </w:r>
+      <w:r>
+        <w:rPr>
+          <w:sz w:val="20"/>
+        </w:rPr>
+        <w:t xml:space="preserve">: five main methods plus controls; no operator-learning networks, no ensembles, no second-order optimisers in the main protocol.</w:t>
       </w:r>
       <w:r>
         <w:rPr>
@@ -9592,7 +10527,7 @@
         <w:rPr>
           <w:sz w:val="20"/>
         </w:rPr>
-        <w:t xml:space="preserve">: B = 8 random draws, a restricted search space with many selected configurations at its edge, Adam for 1500 epochs; Exp B and Exp F show that the neural error moves by a few tenths of a decade (Exp B) with larger budgets; a thoroughly tuned neural pipeline could narrow some gaps.</w:t>
+        <w:t xml:space="preserve">: B = 8 random draws shared across instances, Adam for 1500 epochs, float32, a step-count change at N = 1024; Exp B and Exp F lower the neural error by 0.25–0.7 decade and move outcomes toward the neural family, so a thoroughly tuned neural pipeline could narrow further; Exp F’s L-BFGS arm was capped at 400 iterations (it changed the training loss by &lt; 1% in 21% of refits) and selected the best variant by test error.</w:t>
       </w:r>
       <w:r>
         <w:rPr>
@@ -9654,7 +10589,13 @@
           <w:i/>
           <w:sz w:val="20"/>
         </w:rPr>
-        <w:t xml:space="preserve">only in the number of trials.</w:t>
+        <w:t xml:space="preserve">only in the number of trials</w:t>
+      </w:r>
+      <w:r>
+        <w:rPr>
+          <w:sz w:val="20"/>
+        </w:rPr>
+        <w:t xml:space="preserve">, with unequal numbers of members (3 vs 2).</w:t>
       </w:r>
       <w:r>
         <w:rPr>
@@ -9668,7 +10609,19 @@
           <w:i/>
           <w:sz w:val="20"/>
         </w:rPr>
-        <w:t xml:space="preserve">The diagnostic is confounded with parameter dimension and carried by a few smooth instances.</w:t>
+        <w:t xml:space="preserve">The mechanism controls</w:t>
+      </w:r>
+      <w:r>
+        <w:rPr>
+          <w:sz w:val="20"/>
+        </w:rPr>
+        <w:t xml:space="preserve"> </w:t>
+      </w:r>
+      <w:r>
+        <w:rPr>
+          <w:sz w:val="20"/>
+        </w:rPr>
+        <w:t xml:space="preserve">use oracle-selected, pooled, non-independent cells and a kernel-ridge control that was initially too restrictive.</w:t>
       </w:r>
       <w:r>
         <w:rPr>
@@ -9682,19 +10635,7 @@
           <w:i/>
           <w:sz w:val="20"/>
         </w:rPr>
-        <w:t xml:space="preserve">Staged preregistration is self-hosted</w:t>
-      </w:r>
-      <w:r>
-        <w:rPr>
-          <w:sz w:val="20"/>
-        </w:rPr>
-        <w:t xml:space="preserve"> </w:t>
-      </w:r>
-      <w:r>
-        <w:rPr>
-          <w:sz w:val="20"/>
-        </w:rPr>
-        <w:t xml:space="preserve">(git history on the authors’ repository, with commit hashes recorded; not an independent registry), several experiments were designed after seeing earlier results (post hoc in motivation), and the original run had two disclosed deviations (a non-deterministic seeding of the random search, fixed and replay-verified; an interim look at two of three seeds).</w:t>
+        <w:t xml:space="preserve">The diagnostic is confounded with parameter dimension and carried by a few smooth instances.</w:t>
       </w:r>
       <w:r>
         <w:rPr>
@@ -9708,13 +10649,19 @@
           <w:i/>
           <w:sz w:val="20"/>
         </w:rPr>
-        <w:t xml:space="preserve">The statistical units are few</w:t>
-      </w:r>
-      <w:r>
-        <w:rPr>
-          <w:sz w:val="20"/>
-        </w:rPr>
-        <w:t xml:space="preserve">: 24 instances in 12 families; cell-level tests are not independent.</w:t>
+        <w:t xml:space="preserve">Staged preregistration is self-hosted</w:t>
+      </w:r>
+      <w:r>
+        <w:rPr>
+          <w:sz w:val="20"/>
+        </w:rPr>
+        <w:t xml:space="preserve"> </w:t>
+      </w:r>
+      <w:r>
+        <w:rPr>
+          <w:sz w:val="20"/>
+        </w:rPr>
+        <w:t xml:space="preserve">(git history on the authors’ repository; commit hashes recorded; not an independent registry), several experiments were designed after seeing earlier results (post hoc in motivation), and the original run had disclosed deviations (a non-deterministic seeding of the random search, fixed and replay-verified; an interim look at two of three seeds).</w:t>
       </w:r>
       <w:r>
         <w:rPr>
@@ -9728,13 +10675,49 @@
           <w:i/>
           <w:sz w:val="20"/>
         </w:rPr>
-        <w:t xml:space="preserve">Compute</w:t>
-      </w:r>
-      <w:r>
-        <w:rPr>
-          <w:sz w:val="20"/>
-        </w:rPr>
-        <w:t xml:space="preserve">: CPU, float32 unless stated; timings are not reported as a claim.</w:t>
+        <w:t xml:space="preserve">Statistical units are few</w:t>
+      </w:r>
+      <w:r>
+        <w:rPr>
+          <w:sz w:val="20"/>
+        </w:rPr>
+        <w:t xml:space="preserve">: 24 instances in 12 families for the main comparisons; cell-level tests are not independent. The independent</w:t>
+      </w:r>
+      <w:r>
+        <w:rPr>
+          <w:sz w:val="20"/>
+        </w:rPr>
+        <w:t xml:space="preserve"> </w:t>
+      </w:r>
+      <w:r>
+        <w:rPr>
+          <w:sz w:val="20"/>
+        </w:rPr>
+        <w:t xml:space="preserve">“</w:t>
+      </w:r>
+      <w:r>
+        <w:rPr>
+          <w:sz w:val="20"/>
+        </w:rPr>
+        <w:t xml:space="preserve">audits</w:t>
+      </w:r>
+      <w:r>
+        <w:rPr>
+          <w:sz w:val="20"/>
+        </w:rPr>
+        <w:t xml:space="preserve">”</w:t>
+      </w:r>
+      <w:r>
+        <w:rPr>
+          <w:sz w:val="20"/>
+        </w:rPr>
+        <w:t xml:space="preserve"> </w:t>
+      </w:r>
+      <w:r>
+        <w:rPr>
+          <w:sz w:val="20"/>
+        </w:rPr>
+        <w:t xml:space="preserve">were performed by AI agents, not by human reviewers.</w:t>
       </w:r>
     </w:p>
     <w:bookmarkEnd w:id="42"/>
@@ -9758,7 +10741,7 @@
         <w:rPr>
           <w:sz w:val="20"/>
         </w:rPr>
-        <w:t xml:space="preserve">On 36 synthetic parametric-PDE instances, Gaussian-process reduced surrogates beat lightly tuned neural networks by up to three orders of magnitude on smooth, low-dimensional maps, the advantage is attributable to marginal-likelihood fitting rather than to the linear subspace, and neural networks are at least competitive on problems with moving features and in several high-dimensional cases. A pilot-data diagnostic for predicting the winner was not confirmed on new instances. Practitioners comparing surrogate families should report tie-aware outcomes, state the tuning symmetry and training budget, and include a hyper-parameter-fitted GP baseline.</w:t>
+        <w:t xml:space="preserve">On 36 synthetic parametric-PDE instances, Gaussian-process reduced surrogates beat lightly tuned neural networks by up to about three orders of magnitude on smooth, low-dimensional maps; the advantage does not require the POD subspace and shrinks to a factor of about 2–3 when kernel ridge is given a wide, finely searched hyper-parameter range, so it reflects search and regression quality rather than a neural-versus-linear distinction. Networks win on some problems with moving features and some high-dimensional cases, though a no-POD GP often recovers those. A pilot-data diagnostic was not confirmed on new instances. Practitioners comparing surrogate families should report tie-aware outcomes, state the tuning symmetry, search ranges and training budget, and include a well-tuned GP/kernel baseline.</w:t>
       </w:r>
     </w:p>
     <w:bookmarkEnd w:id="43"/>

</xml_diff>